<commit_message>
Update CompilerDesign documentation and archive tests 1-10 for test-3
- Updated CompilerDesign Word and PDF files.
- Archived corresponding test-3 tests (1-10).
</commit_message>
<xml_diff>
--- a/CompilerDesign.docx
+++ b/CompilerDesign.docx
@@ -116,6 +116,7 @@
         </w:rPr>
         <w:t xml:space="preserve"> assembly language. The </w:t>
       </w:r>
+      <w:proofErr w:type="gramStart"/>
       <w:r>
         <w:rPr>
           <w:rFonts w:ascii="David" w:eastAsia="David" w:hAnsi="David" w:cs="David"/>
@@ -128,7 +129,14 @@
         <w:rPr>
           <w:rFonts w:ascii="David" w:eastAsia="David" w:hAnsi="David" w:cs="David"/>
         </w:rPr>
-        <w:t xml:space="preserve"> language includes the following features:</w:t>
+        <w:t xml:space="preserve"> language</w:t>
+      </w:r>
+      <w:proofErr w:type="gramEnd"/>
+      <w:r>
+        <w:rPr>
+          <w:rFonts w:ascii="David" w:eastAsia="David" w:hAnsi="David" w:cs="David"/>
+        </w:rPr>
+        <w:t xml:space="preserve"> includes the following features:</w:t>
       </w:r>
     </w:p>
     <w:p>
@@ -268,20 +276,6 @@
         <w:rPr>
           <w:rFonts w:ascii="David" w:eastAsia="David" w:hAnsi="David" w:cs="David"/>
         </w:rPr>
-        <w:t xml:space="preserve">, </w:t>
-      </w:r>
-      <w:r>
-        <w:rPr>
-          <w:rStyle w:val="VerbatimChar"/>
-          <w:rFonts w:ascii="David" w:eastAsia="David" w:hAnsi="David" w:cs="David"/>
-          <w:sz w:val="24"/>
-        </w:rPr>
-        <w:t>do-while</w:t>
-      </w:r>
-      <w:r>
-        <w:rPr>
-          <w:rFonts w:ascii="David" w:eastAsia="David" w:hAnsi="David" w:cs="David"/>
-        </w:rPr>
         <w:t>.</w:t>
       </w:r>
     </w:p>
@@ -593,7 +587,7 @@
         <w:rPr>
           <w:rFonts w:ascii="David" w:eastAsia="David" w:hAnsi="David" w:cs="David"/>
         </w:rPr>
-        <w:t>. The design is modular, with clear separation between lexical analysis, syntax analysis, semantic analysis, and code generation. The key design principles include:</w:t>
+        <w:t>. The key design principles include:</w:t>
       </w:r>
     </w:p>
     <w:p>
@@ -1130,13 +1124,23 @@
         </w:rPr>
         <w:t xml:space="preserve"> is implemented using a </w:t>
       </w:r>
-      <w:r>
-        <w:rPr>
-          <w:rStyle w:val="VerbatimChar"/>
-          <w:rFonts w:ascii="David" w:eastAsia="David" w:hAnsi="David" w:cs="David"/>
-          <w:sz w:val="24"/>
-        </w:rPr>
-        <w:t>std::map&lt;std::string, Symbol&gt;</w:t>
+      <w:proofErr w:type="gramStart"/>
+      <w:r>
+        <w:rPr>
+          <w:rStyle w:val="VerbatimChar"/>
+          <w:rFonts w:ascii="David" w:eastAsia="David" w:hAnsi="David" w:cs="David"/>
+          <w:sz w:val="24"/>
+        </w:rPr>
+        <w:t>std::</w:t>
+      </w:r>
+      <w:proofErr w:type="gramEnd"/>
+      <w:r>
+        <w:rPr>
+          <w:rStyle w:val="VerbatimChar"/>
+          <w:rFonts w:ascii="David" w:eastAsia="David" w:hAnsi="David" w:cs="David"/>
+          <w:sz w:val="24"/>
+        </w:rPr>
+        <w:t>map&lt;std::string, Symbol&gt;</w:t>
       </w:r>
       <w:r>
         <w:rPr>
@@ -1210,13 +1214,23 @@
         </w:rPr>
         <w:t xml:space="preserve">: A </w:t>
       </w:r>
-      <w:r>
-        <w:rPr>
-          <w:rStyle w:val="VerbatimChar"/>
-          <w:rFonts w:ascii="David" w:eastAsia="David" w:hAnsi="David" w:cs="David"/>
-          <w:sz w:val="24"/>
-        </w:rPr>
-        <w:t>std::map&lt;int, Type&gt;</w:t>
+      <w:proofErr w:type="gramStart"/>
+      <w:r>
+        <w:rPr>
+          <w:rStyle w:val="VerbatimChar"/>
+          <w:rFonts w:ascii="David" w:eastAsia="David" w:hAnsi="David" w:cs="David"/>
+          <w:sz w:val="24"/>
+        </w:rPr>
+        <w:t>std::</w:t>
+      </w:r>
+      <w:proofErr w:type="gramEnd"/>
+      <w:r>
+        <w:rPr>
+          <w:rStyle w:val="VerbatimChar"/>
+          <w:rFonts w:ascii="David" w:eastAsia="David" w:hAnsi="David" w:cs="David"/>
+          <w:sz w:val="24"/>
+        </w:rPr>
+        <w:t>map&lt;int, Type&gt;</w:t>
       </w:r>
       <w:r>
         <w:rPr>
@@ -1294,13 +1308,23 @@
         </w:rPr>
         <w:t xml:space="preserve">: A </w:t>
       </w:r>
-      <w:r>
-        <w:rPr>
-          <w:rStyle w:val="VerbatimChar"/>
-          <w:rFonts w:ascii="David" w:eastAsia="David" w:hAnsi="David" w:cs="David"/>
-          <w:sz w:val="24"/>
-        </w:rPr>
-        <w:t>std::map&lt;int, int&gt;</w:t>
+      <w:proofErr w:type="gramStart"/>
+      <w:r>
+        <w:rPr>
+          <w:rStyle w:val="VerbatimChar"/>
+          <w:rFonts w:ascii="David" w:eastAsia="David" w:hAnsi="David" w:cs="David"/>
+          <w:sz w:val="24"/>
+        </w:rPr>
+        <w:t>std::</w:t>
+      </w:r>
+      <w:proofErr w:type="gramEnd"/>
+      <w:r>
+        <w:rPr>
+          <w:rStyle w:val="VerbatimChar"/>
+          <w:rFonts w:ascii="David" w:eastAsia="David" w:hAnsi="David" w:cs="David"/>
+          <w:sz w:val="24"/>
+        </w:rPr>
+        <w:t>map&lt;int, int&gt;</w:t>
       </w:r>
       <w:r>
         <w:rPr>
@@ -1521,7 +1545,25 @@
           <w:rFonts w:ascii="David" w:eastAsia="David" w:hAnsi="David" w:cs="David"/>
           <w:sz w:val="24"/>
         </w:rPr>
-        <w:t>int main() {</w:t>
+        <w:t xml:space="preserve">int </w:t>
+      </w:r>
+      <w:proofErr w:type="gramStart"/>
+      <w:r>
+        <w:rPr>
+          <w:rStyle w:val="VerbatimChar"/>
+          <w:rFonts w:ascii="David" w:eastAsia="David" w:hAnsi="David" w:cs="David"/>
+          <w:sz w:val="24"/>
+        </w:rPr>
+        <w:t>main(</w:t>
+      </w:r>
+      <w:proofErr w:type="gramEnd"/>
+      <w:r>
+        <w:rPr>
+          <w:rStyle w:val="VerbatimChar"/>
+          <w:rFonts w:ascii="David" w:eastAsia="David" w:hAnsi="David" w:cs="David"/>
+          <w:sz w:val="24"/>
+        </w:rPr>
+        <w:t>) {</w:t>
       </w:r>
       <w:r>
         <w:br/>
@@ -1657,14 +1699,24 @@
           <w:rFonts w:ascii="David" w:eastAsia="David" w:hAnsi="David" w:cs="David"/>
           <w:sz w:val="24"/>
         </w:rPr>
-        <w:t xml:space="preserve">:int </w:t>
-      </w:r>
-      <w:r>
-        <w:rPr>
-          <w:rFonts w:ascii="David" w:eastAsia="David" w:hAnsi="David" w:cs="David"/>
-        </w:rPr>
         <w:t>:</w:t>
       </w:r>
+      <w:proofErr w:type="gramStart"/>
+      <w:r>
+        <w:rPr>
+          <w:rStyle w:val="VerbatimChar"/>
+          <w:rFonts w:ascii="David" w:eastAsia="David" w:hAnsi="David" w:cs="David"/>
+          <w:sz w:val="24"/>
+        </w:rPr>
+        <w:t xml:space="preserve">int </w:t>
+      </w:r>
+      <w:r>
+        <w:rPr>
+          <w:rFonts w:ascii="David" w:eastAsia="David" w:hAnsi="David" w:cs="David"/>
+        </w:rPr>
+        <w:t>:</w:t>
+      </w:r>
+      <w:proofErr w:type="gramEnd"/>
     </w:p>
     <w:p>
       <w:pPr>
@@ -1707,7 +1759,43 @@
           <w:rFonts w:ascii="David" w:eastAsia="David" w:hAnsi="David" w:cs="David"/>
           <w:sz w:val="24"/>
         </w:rPr>
-        <w:t xml:space="preserve">  "x": { type: {1: int_}, offset: {1: -8}, depth: 1 }</w:t>
+        <w:t xml:space="preserve">  "x": </w:t>
+      </w:r>
+      <w:proofErr w:type="gramStart"/>
+      <w:r>
+        <w:rPr>
+          <w:rStyle w:val="VerbatimChar"/>
+          <w:rFonts w:ascii="David" w:eastAsia="David" w:hAnsi="David" w:cs="David"/>
+          <w:sz w:val="24"/>
+        </w:rPr>
+        <w:t>{ type</w:t>
+      </w:r>
+      <w:proofErr w:type="gramEnd"/>
+      <w:r>
+        <w:rPr>
+          <w:rStyle w:val="VerbatimChar"/>
+          <w:rFonts w:ascii="David" w:eastAsia="David" w:hAnsi="David" w:cs="David"/>
+          <w:sz w:val="24"/>
+        </w:rPr>
+        <w:t xml:space="preserve">: {1: </w:t>
+      </w:r>
+      <w:proofErr w:type="gramStart"/>
+      <w:r>
+        <w:rPr>
+          <w:rStyle w:val="VerbatimChar"/>
+          <w:rFonts w:ascii="David" w:eastAsia="David" w:hAnsi="David" w:cs="David"/>
+          <w:sz w:val="24"/>
+        </w:rPr>
+        <w:t>int_}</w:t>
+      </w:r>
+      <w:proofErr w:type="gramEnd"/>
+      <w:r>
+        <w:rPr>
+          <w:rStyle w:val="VerbatimChar"/>
+          <w:rFonts w:ascii="David" w:eastAsia="David" w:hAnsi="David" w:cs="David"/>
+          <w:sz w:val="24"/>
+        </w:rPr>
+        <w:t>, offset: {1: -8}, depth: 1 }</w:t>
       </w:r>
       <w:r>
         <w:br/>
@@ -1738,6 +1826,7 @@
         </w:rPr>
         <w:t xml:space="preserve">After </w:t>
       </w:r>
+      <w:proofErr w:type="gramStart"/>
       <w:r>
         <w:rPr>
           <w:rStyle w:val="VerbatimChar"/>
@@ -1752,7 +1841,16 @@
           <w:rFonts w:ascii="David" w:eastAsia="David" w:hAnsi="David" w:cs="David"/>
           <w:sz w:val="24"/>
         </w:rPr>
-        <w:t xml:space="preserve">:float </w:t>
+        <w:t>:float</w:t>
+      </w:r>
+      <w:proofErr w:type="gramEnd"/>
+      <w:r>
+        <w:rPr>
+          <w:rStyle w:val="VerbatimChar"/>
+          <w:rFonts w:ascii="David" w:eastAsia="David" w:hAnsi="David" w:cs="David"/>
+          <w:sz w:val="24"/>
+        </w:rPr>
+        <w:t xml:space="preserve"> </w:t>
       </w:r>
       <w:r>
         <w:rPr>
@@ -1799,10 +1897,54 @@
           <w:rFonts w:ascii="David" w:eastAsia="David" w:hAnsi="David" w:cs="David"/>
           <w:sz w:val="24"/>
         </w:rPr>
-        <w:t xml:space="preserve">  "x": { type: {1: int_, 2: float_}, offset: {1: -8, 2: -12}, depth: 2 }</w:t>
+        <w:t xml:space="preserve">  "x": </w:t>
+      </w:r>
+      <w:proofErr w:type="gramStart"/>
+      <w:r>
+        <w:rPr>
+          <w:rStyle w:val="VerbatimChar"/>
+          <w:rFonts w:ascii="David" w:eastAsia="David" w:hAnsi="David" w:cs="David"/>
+          <w:sz w:val="24"/>
+        </w:rPr>
+        <w:t>{ type</w:t>
+      </w:r>
+      <w:proofErr w:type="gramEnd"/>
+      <w:r>
+        <w:rPr>
+          <w:rStyle w:val="VerbatimChar"/>
+          <w:rFonts w:ascii="David" w:eastAsia="David" w:hAnsi="David" w:cs="David"/>
+          <w:sz w:val="24"/>
+        </w:rPr>
+        <w:t xml:space="preserve">: {1: int_, 2: </w:t>
+      </w:r>
+      <w:proofErr w:type="gramStart"/>
+      <w:r>
+        <w:rPr>
+          <w:rStyle w:val="VerbatimChar"/>
+          <w:rFonts w:ascii="David" w:eastAsia="David" w:hAnsi="David" w:cs="David"/>
+          <w:sz w:val="24"/>
+        </w:rPr>
+        <w:t>float_}</w:t>
+      </w:r>
+      <w:proofErr w:type="gramEnd"/>
+      <w:r>
+        <w:rPr>
+          <w:rStyle w:val="VerbatimChar"/>
+          <w:rFonts w:ascii="David" w:eastAsia="David" w:hAnsi="David" w:cs="David"/>
+          <w:sz w:val="24"/>
+        </w:rPr>
+        <w:t>, offset: {1: -8, 2: -12}, depth: 2 }</w:t>
       </w:r>
       <w:r>
         <w:br/>
+      </w:r>
+      <w:r>
+        <w:rPr>
+          <w:rStyle w:val="VerbatimChar"/>
+          <w:rFonts w:ascii="David" w:eastAsia="David" w:hAnsi="David" w:cs="David"/>
+          <w:sz w:val="24"/>
+        </w:rPr>
+        <w:t>}</w:t>
       </w:r>
     </w:p>
     <w:p>
@@ -1864,7 +2006,43 @@
           <w:rFonts w:ascii="David" w:eastAsia="David" w:hAnsi="David" w:cs="David"/>
           <w:sz w:val="24"/>
         </w:rPr>
-        <w:t xml:space="preserve">  "x": { type: {1: int_}, offset: {1: -8}, depth: 1 }</w:t>
+        <w:t xml:space="preserve">  "x": </w:t>
+      </w:r>
+      <w:proofErr w:type="gramStart"/>
+      <w:r>
+        <w:rPr>
+          <w:rStyle w:val="VerbatimChar"/>
+          <w:rFonts w:ascii="David" w:eastAsia="David" w:hAnsi="David" w:cs="David"/>
+          <w:sz w:val="24"/>
+        </w:rPr>
+        <w:t>{ type</w:t>
+      </w:r>
+      <w:proofErr w:type="gramEnd"/>
+      <w:r>
+        <w:rPr>
+          <w:rStyle w:val="VerbatimChar"/>
+          <w:rFonts w:ascii="David" w:eastAsia="David" w:hAnsi="David" w:cs="David"/>
+          <w:sz w:val="24"/>
+        </w:rPr>
+        <w:t xml:space="preserve">: {1: </w:t>
+      </w:r>
+      <w:proofErr w:type="gramStart"/>
+      <w:r>
+        <w:rPr>
+          <w:rStyle w:val="VerbatimChar"/>
+          <w:rFonts w:ascii="David" w:eastAsia="David" w:hAnsi="David" w:cs="David"/>
+          <w:sz w:val="24"/>
+        </w:rPr>
+        <w:t>int_}</w:t>
+      </w:r>
+      <w:proofErr w:type="gramEnd"/>
+      <w:r>
+        <w:rPr>
+          <w:rStyle w:val="VerbatimChar"/>
+          <w:rFonts w:ascii="David" w:eastAsia="David" w:hAnsi="David" w:cs="David"/>
+          <w:sz w:val="24"/>
+        </w:rPr>
+        <w:t>, offset: {1: -8}, depth: 1 }</w:t>
       </w:r>
       <w:r>
         <w:br/>
@@ -2005,13 +2183,23 @@
         </w:rPr>
         <w:t xml:space="preserve"> is implemented as a </w:t>
       </w:r>
-      <w:r>
-        <w:rPr>
-          <w:rStyle w:val="VerbatimChar"/>
-          <w:rFonts w:ascii="David" w:eastAsia="David" w:hAnsi="David" w:cs="David"/>
-          <w:sz w:val="24"/>
-        </w:rPr>
-        <w:t>std::map&lt;std::string, Function&gt;</w:t>
+      <w:proofErr w:type="gramStart"/>
+      <w:r>
+        <w:rPr>
+          <w:rStyle w:val="VerbatimChar"/>
+          <w:rFonts w:ascii="David" w:eastAsia="David" w:hAnsi="David" w:cs="David"/>
+          <w:sz w:val="24"/>
+        </w:rPr>
+        <w:t>std::</w:t>
+      </w:r>
+      <w:proofErr w:type="gramEnd"/>
+      <w:r>
+        <w:rPr>
+          <w:rStyle w:val="VerbatimChar"/>
+          <w:rFonts w:ascii="David" w:eastAsia="David" w:hAnsi="David" w:cs="David"/>
+          <w:sz w:val="24"/>
+        </w:rPr>
+        <w:t>map&lt;std::string, Function&gt;</w:t>
       </w:r>
       <w:r>
         <w:rPr>
@@ -2072,6 +2260,7 @@
         </w:rPr>
       </w:pPr>
       <w:proofErr w:type="spellStart"/>
+      <w:proofErr w:type="gramStart"/>
       <w:r>
         <w:rPr>
           <w:rStyle w:val="VerbatimChar"/>
@@ -2081,6 +2270,7 @@
         <w:t>isDefined</w:t>
       </w:r>
       <w:proofErr w:type="spellEnd"/>
+      <w:proofErr w:type="gramEnd"/>
       <w:r>
         <w:rPr>
           <w:rFonts w:ascii="David" w:eastAsia="David" w:hAnsi="David" w:cs="David"/>
@@ -2385,11 +2575,19 @@
         </w:rPr>
         <w:t xml:space="preserve">For </w:t>
       </w:r>
-      <w:r>
-        <w:rPr>
-          <w:rFonts w:ascii="David" w:eastAsia="David" w:hAnsi="David" w:cs="David"/>
-        </w:rPr>
-        <w:t xml:space="preserve">both of them </w:t>
+      <w:proofErr w:type="gramStart"/>
+      <w:r>
+        <w:rPr>
+          <w:rFonts w:ascii="David" w:eastAsia="David" w:hAnsi="David" w:cs="David"/>
+        </w:rPr>
+        <w:t>both of them</w:t>
+      </w:r>
+      <w:proofErr w:type="gramEnd"/>
+      <w:r>
+        <w:rPr>
+          <w:rFonts w:ascii="David" w:eastAsia="David" w:hAnsi="David" w:cs="David"/>
+        </w:rPr>
+        <w:t xml:space="preserve"> </w:t>
       </w:r>
       <w:r>
         <w:rPr>
@@ -2437,9 +2635,19 @@
           <w:rFonts w:ascii="David" w:eastAsia="David" w:hAnsi="David" w:cs="David"/>
           <w:sz w:val="24"/>
         </w:rPr>
-        <w:t>float sum(</w:t>
+        <w:t xml:space="preserve">float </w:t>
+      </w:r>
+      <w:proofErr w:type="gramStart"/>
+      <w:r>
+        <w:rPr>
+          <w:rStyle w:val="VerbatimChar"/>
+          <w:rFonts w:ascii="David" w:eastAsia="David" w:hAnsi="David" w:cs="David"/>
+          <w:sz w:val="24"/>
+        </w:rPr>
+        <w:t>sum(</w:t>
       </w:r>
       <w:proofErr w:type="spellStart"/>
+      <w:proofErr w:type="gramEnd"/>
       <w:r>
         <w:rPr>
           <w:rStyle w:val="VerbatimChar"/>
@@ -2928,13 +3136,23 @@
           <w:rFonts w:ascii="David" w:eastAsia="David" w:hAnsi="David" w:cs="David"/>
         </w:rPr>
       </w:pPr>
-      <w:r>
-        <w:rPr>
-          <w:rStyle w:val="VerbatimChar"/>
-          <w:rFonts w:ascii="David" w:eastAsia="David" w:hAnsi="David" w:cs="David"/>
-          <w:sz w:val="24"/>
-        </w:rPr>
-        <w:t>emit(const std::string&amp;)</w:t>
+      <w:proofErr w:type="gramStart"/>
+      <w:r>
+        <w:rPr>
+          <w:rStyle w:val="VerbatimChar"/>
+          <w:rFonts w:ascii="David" w:eastAsia="David" w:hAnsi="David" w:cs="David"/>
+          <w:sz w:val="24"/>
+        </w:rPr>
+        <w:t>emit(</w:t>
+      </w:r>
+      <w:proofErr w:type="gramEnd"/>
+      <w:r>
+        <w:rPr>
+          <w:rStyle w:val="VerbatimChar"/>
+          <w:rFonts w:ascii="David" w:eastAsia="David" w:hAnsi="David" w:cs="David"/>
+          <w:sz w:val="24"/>
+        </w:rPr>
+        <w:t>const std::string&amp;)</w:t>
       </w:r>
       <w:r>
         <w:rPr>
@@ -2957,6 +3175,7 @@
         </w:rPr>
       </w:pPr>
       <w:proofErr w:type="spellStart"/>
+      <w:proofErr w:type="gramStart"/>
       <w:r>
         <w:rPr>
           <w:rStyle w:val="VerbatimChar"/>
@@ -2972,7 +3191,16 @@
           <w:rFonts w:ascii="David" w:eastAsia="David" w:hAnsi="David" w:cs="David"/>
           <w:sz w:val="24"/>
         </w:rPr>
-        <w:t>(const std::string&amp;)</w:t>
+        <w:t>(</w:t>
+      </w:r>
+      <w:proofErr w:type="gramEnd"/>
+      <w:r>
+        <w:rPr>
+          <w:rStyle w:val="VerbatimChar"/>
+          <w:rFonts w:ascii="David" w:eastAsia="David" w:hAnsi="David" w:cs="David"/>
+          <w:sz w:val="24"/>
+        </w:rPr>
+        <w:t>const std::string&amp;)</w:t>
       </w:r>
       <w:r>
         <w:rPr>
@@ -2994,13 +3222,23 @@
           <w:rFonts w:ascii="David" w:eastAsia="David" w:hAnsi="David" w:cs="David"/>
         </w:rPr>
       </w:pPr>
-      <w:r>
-        <w:rPr>
-          <w:rStyle w:val="VerbatimChar"/>
-          <w:rFonts w:ascii="David" w:eastAsia="David" w:hAnsi="David" w:cs="David"/>
-          <w:sz w:val="24"/>
-        </w:rPr>
-        <w:t>backpatch(const std::vector&lt;int&gt;&amp;, int)</w:t>
+      <w:proofErr w:type="gramStart"/>
+      <w:r>
+        <w:rPr>
+          <w:rStyle w:val="VerbatimChar"/>
+          <w:rFonts w:ascii="David" w:eastAsia="David" w:hAnsi="David" w:cs="David"/>
+          <w:sz w:val="24"/>
+        </w:rPr>
+        <w:t>backpatch(</w:t>
+      </w:r>
+      <w:proofErr w:type="gramEnd"/>
+      <w:r>
+        <w:rPr>
+          <w:rStyle w:val="VerbatimChar"/>
+          <w:rFonts w:ascii="David" w:eastAsia="David" w:hAnsi="David" w:cs="David"/>
+          <w:sz w:val="24"/>
+        </w:rPr>
+        <w:t>const std::vector&lt;int&gt;&amp;, int)</w:t>
       </w:r>
       <w:r>
         <w:rPr>
@@ -3035,6 +3273,7 @@
     <w:p>
       <w:pPr>
         <w:spacing w:line="276" w:lineRule="auto"/>
+        <w:jc w:val="both"/>
         <w:rPr>
           <w:rStyle w:val="VerbatimChar"/>
           <w:rFonts w:ascii="David" w:eastAsia="David" w:hAnsi="David" w:cs="David"/>
@@ -3052,38 +3291,128 @@
           <w:rFonts w:ascii="David" w:eastAsia="David" w:hAnsi="David" w:cs="David"/>
           <w:sz w:val="24"/>
         </w:rPr>
-        <w:t xml:space="preserve">Line 5: </w:t>
-      </w:r>
-      <w:r>
-        <w:rPr>
-          <w:rStyle w:val="VerbatimChar"/>
-          <w:rFonts w:ascii="David" w:eastAsia="David" w:hAnsi="David" w:cs="David"/>
-          <w:sz w:val="24"/>
-        </w:rPr>
-        <w:t>buffer-&gt;emit("BREQZ I1 ");</w:t>
-      </w:r>
-      <w:r>
-        <w:br/>
-      </w:r>
-      <w:r>
-        <w:rPr>
-          <w:rStyle w:val="VerbatimChar"/>
-          <w:rFonts w:ascii="David" w:eastAsia="David" w:hAnsi="David" w:cs="David"/>
-          <w:sz w:val="24"/>
-        </w:rPr>
-        <w:t>buffer-&gt;backpatch(5, 10);  // Resolves the placeholder at line 5 to line 10.</w:t>
-      </w:r>
-    </w:p>
-    <w:p>
-      <w:pPr>
-        <w:spacing w:line="276" w:lineRule="auto"/>
-        <w:jc w:val="both"/>
-        <w:rPr>
-          <w:rStyle w:val="VerbatimChar"/>
-          <w:rFonts w:ascii="David" w:eastAsia="David" w:hAnsi="David" w:cs="David"/>
-          <w:sz w:val="24"/>
-        </w:rPr>
-      </w:pPr>
+        <w:t>buffer-&gt;</w:t>
+      </w:r>
+      <w:proofErr w:type="gramStart"/>
+      <w:r>
+        <w:rPr>
+          <w:rStyle w:val="VerbatimChar"/>
+          <w:rFonts w:ascii="David" w:eastAsia="David" w:hAnsi="David" w:cs="David"/>
+          <w:sz w:val="24"/>
+        </w:rPr>
+        <w:t>emit(</w:t>
+      </w:r>
+      <w:proofErr w:type="gramEnd"/>
+      <w:r>
+        <w:rPr>
+          <w:rStyle w:val="VerbatimChar"/>
+          <w:rFonts w:ascii="David" w:eastAsia="David" w:hAnsi="David" w:cs="David"/>
+          <w:sz w:val="24"/>
+        </w:rPr>
+        <w:t xml:space="preserve">"BREQZ I1 ");  </w:t>
+      </w:r>
+    </w:p>
+    <w:p>
+      <w:pPr>
+        <w:spacing w:line="276" w:lineRule="auto"/>
+        <w:jc w:val="both"/>
+        <w:rPr>
+          <w:rStyle w:val="VerbatimChar"/>
+          <w:rFonts w:ascii="David" w:eastAsia="David" w:hAnsi="David" w:cs="David"/>
+          <w:sz w:val="24"/>
+        </w:rPr>
+      </w:pPr>
+      <w:r>
+        <w:rPr>
+          <w:rStyle w:val="VerbatimChar"/>
+          <w:rFonts w:ascii="David" w:eastAsia="David" w:hAnsi="David" w:cs="David"/>
+          <w:sz w:val="24"/>
+        </w:rPr>
+        <w:t xml:space="preserve">vector&lt;int&gt; </w:t>
+      </w:r>
+      <w:proofErr w:type="spellStart"/>
+      <w:r>
+        <w:rPr>
+          <w:rStyle w:val="VerbatimChar"/>
+          <w:rFonts w:ascii="David" w:eastAsia="David" w:hAnsi="David" w:cs="David"/>
+          <w:sz w:val="24"/>
+        </w:rPr>
+        <w:t>placeholderLines</w:t>
+      </w:r>
+      <w:proofErr w:type="spellEnd"/>
+      <w:r>
+        <w:rPr>
+          <w:rStyle w:val="VerbatimChar"/>
+          <w:rFonts w:ascii="David" w:eastAsia="David" w:hAnsi="David" w:cs="David"/>
+          <w:sz w:val="24"/>
+        </w:rPr>
+        <w:t xml:space="preserve"> = {5</w:t>
+      </w:r>
+      <w:proofErr w:type="gramStart"/>
+      <w:r>
+        <w:rPr>
+          <w:rStyle w:val="VerbatimChar"/>
+          <w:rFonts w:ascii="David" w:eastAsia="David" w:hAnsi="David" w:cs="David"/>
+          <w:sz w:val="24"/>
+        </w:rPr>
+        <w:t>};</w:t>
+      </w:r>
+      <w:proofErr w:type="gramEnd"/>
+      <w:r>
+        <w:rPr>
+          <w:rStyle w:val="VerbatimChar"/>
+          <w:rFonts w:ascii="David" w:eastAsia="David" w:hAnsi="David" w:cs="David"/>
+          <w:sz w:val="24"/>
+        </w:rPr>
+        <w:t xml:space="preserve">  </w:t>
+      </w:r>
+    </w:p>
+    <w:p>
+      <w:pPr>
+        <w:spacing w:line="276" w:lineRule="auto"/>
+        <w:jc w:val="both"/>
+        <w:rPr>
+          <w:rStyle w:val="VerbatimChar"/>
+          <w:rFonts w:ascii="David" w:eastAsia="David" w:hAnsi="David" w:cs="David"/>
+          <w:sz w:val="24"/>
+        </w:rPr>
+      </w:pPr>
+      <w:r>
+        <w:rPr>
+          <w:rStyle w:val="VerbatimChar"/>
+          <w:rFonts w:ascii="David" w:eastAsia="David" w:hAnsi="David" w:cs="David"/>
+          <w:sz w:val="24"/>
+        </w:rPr>
+        <w:t>buffer-&gt;</w:t>
+      </w:r>
+      <w:proofErr w:type="gramStart"/>
+      <w:r>
+        <w:rPr>
+          <w:rStyle w:val="VerbatimChar"/>
+          <w:rFonts w:ascii="David" w:eastAsia="David" w:hAnsi="David" w:cs="David"/>
+          <w:sz w:val="24"/>
+        </w:rPr>
+        <w:t>backpatch(</w:t>
+      </w:r>
+      <w:proofErr w:type="spellStart"/>
+      <w:proofErr w:type="gramEnd"/>
+      <w:r>
+        <w:rPr>
+          <w:rStyle w:val="VerbatimChar"/>
+          <w:rFonts w:ascii="David" w:eastAsia="David" w:hAnsi="David" w:cs="David"/>
+          <w:sz w:val="24"/>
+        </w:rPr>
+        <w:t>placeholderLines</w:t>
+      </w:r>
+      <w:proofErr w:type="spellEnd"/>
+      <w:r>
+        <w:rPr>
+          <w:rStyle w:val="VerbatimChar"/>
+          <w:rFonts w:ascii="David" w:eastAsia="David" w:hAnsi="David" w:cs="David"/>
+          <w:sz w:val="24"/>
+        </w:rPr>
+        <w:t xml:space="preserve">, 10);  </w:t>
+      </w:r>
     </w:p>
     <w:p>
       <w:pPr>
@@ -3418,6 +3747,7 @@
         <w:t xml:space="preserve">The </w:t>
       </w:r>
       <w:proofErr w:type="spellStart"/>
+      <w:proofErr w:type="gramStart"/>
       <w:r>
         <w:rPr>
           <w:rFonts w:ascii="David" w:eastAsia="David" w:hAnsi="David" w:cs="David"/>
@@ -3427,6 +3757,7 @@
         <w:t>nextList</w:t>
       </w:r>
       <w:proofErr w:type="spellEnd"/>
+      <w:proofErr w:type="gramEnd"/>
       <w:r>
         <w:rPr>
           <w:rFonts w:ascii="David" w:eastAsia="David" w:hAnsi="David" w:cs="David"/>
@@ -3675,7 +4006,33 @@
         <w:rPr>
           <w:rFonts w:ascii="David" w:eastAsia="David" w:hAnsi="David" w:cs="David"/>
         </w:rPr>
-        <w:t xml:space="preserve"> of the block is backpatched to the line after the block in the buffer.</w:t>
+        <w:t xml:space="preserve"> of the block is backpatched to the</w:t>
+      </w:r>
+      <w:r>
+        <w:rPr>
+          <w:rFonts w:ascii="David" w:eastAsia="David" w:hAnsi="David" w:cs="David"/>
+        </w:rPr>
+        <w:t xml:space="preserve"> </w:t>
+      </w:r>
+      <w:proofErr w:type="gramStart"/>
+      <w:r>
+        <w:rPr>
+          <w:rFonts w:ascii="David" w:eastAsia="David" w:hAnsi="David" w:cs="David"/>
+        </w:rPr>
+        <w:t xml:space="preserve">next </w:t>
+      </w:r>
+      <w:r>
+        <w:rPr>
+          <w:rFonts w:ascii="David" w:eastAsia="David" w:hAnsi="David" w:cs="David"/>
+        </w:rPr>
+        <w:t xml:space="preserve"> block</w:t>
+      </w:r>
+      <w:proofErr w:type="gramEnd"/>
+      <w:r>
+        <w:rPr>
+          <w:rFonts w:ascii="David" w:eastAsia="David" w:hAnsi="David" w:cs="David"/>
+        </w:rPr>
+        <w:t>.</w:t>
       </w:r>
     </w:p>
     <w:p>
@@ -3899,8 +4256,18 @@
           <w:rFonts w:ascii="David" w:eastAsia="David" w:hAnsi="David" w:cs="David"/>
           <w:sz w:val="24"/>
         </w:rPr>
-        <w:t>x = x + 1;</w:t>
-      </w:r>
+        <w:t xml:space="preserve">x = x + </w:t>
+      </w:r>
+      <w:proofErr w:type="gramStart"/>
+      <w:r>
+        <w:rPr>
+          <w:rStyle w:val="VerbatimChar"/>
+          <w:rFonts w:ascii="David" w:eastAsia="David" w:hAnsi="David" w:cs="David"/>
+          <w:sz w:val="24"/>
+        </w:rPr>
+        <w:t>1;</w:t>
+      </w:r>
+      <w:proofErr w:type="gramEnd"/>
     </w:p>
     <w:p>
       <w:pPr>
@@ -4147,7 +4514,21 @@
         <w:rPr>
           <w:rFonts w:ascii="David" w:eastAsia="David" w:hAnsi="David" w:cs="David"/>
         </w:rPr>
-        <w:t>: Stored in register I0. This is the address to which the program will return after the function call completes.</w:t>
+        <w:t xml:space="preserve">: Stored in register I0. This is the address to which the program will return after the function call </w:t>
+      </w:r>
+      <w:proofErr w:type="gramStart"/>
+      <w:r>
+        <w:rPr>
+          <w:rFonts w:ascii="David" w:eastAsia="David" w:hAnsi="David" w:cs="David"/>
+        </w:rPr>
+        <w:t>completes</w:t>
+      </w:r>
+      <w:proofErr w:type="gramEnd"/>
+      <w:r>
+        <w:rPr>
+          <w:rFonts w:ascii="David" w:eastAsia="David" w:hAnsi="David" w:cs="David"/>
+        </w:rPr>
+        <w:t>.</w:t>
       </w:r>
     </w:p>
     <w:p>
@@ -4293,31 +4674,34 @@
     </w:p>
     <w:p>
       <w:pPr>
-        <w:spacing w:before="240" w:after="240" w:line="276" w:lineRule="auto"/>
-        <w:jc w:val="both"/>
-        <w:rPr>
-          <w:rFonts w:ascii="David" w:eastAsia="David" w:hAnsi="David" w:cs="David"/>
-        </w:rPr>
-      </w:pPr>
-      <w:r>
-        <w:rPr>
-          <w:rFonts w:ascii="David" w:eastAsia="David" w:hAnsi="David" w:cs="David"/>
-        </w:rPr>
-        <w:t>For variadic functions, the first parameter (in function call) is always an integer (</w:t>
-      </w:r>
-      <w:proofErr w:type="spellStart"/>
-      <w:r>
-        <w:rPr>
-          <w:rFonts w:ascii="David" w:eastAsia="David" w:hAnsi="David" w:cs="David"/>
-        </w:rPr>
-        <w:t>n:int</w:t>
-      </w:r>
-      <w:proofErr w:type="spellEnd"/>
-      <w:r>
-        <w:rPr>
-          <w:rFonts w:ascii="David" w:eastAsia="David" w:hAnsi="David" w:cs="David"/>
-        </w:rPr>
-        <w:t>) that specifies the number of variadic arguments. This parameter is passed as the first argument in the function call and is always the last parameter in the function definition. The compiler uses register I3 to store the offset of n relative to the frame pointer (I1). This allows the function to dynamically access the variadic arguments during execution.</w:t>
+        <w:pStyle w:val="BodyText"/>
+      </w:pPr>
+      <w:r>
+        <w:t xml:space="preserve">For variadic functions, the number of variadic arguments (n) is explicitly passed as the </w:t>
+      </w:r>
+      <w:proofErr w:type="gramStart"/>
+      <w:r>
+        <w:t>last named</w:t>
+      </w:r>
+      <w:proofErr w:type="gramEnd"/>
+      <w:r>
+        <w:t xml:space="preserve"> parameter before the ellipsis (...) in the function definition. This parameter is an integer (int) that specifies the number of variadic arguments. During a function call, the caller explicitly calculates and passes the value of n as the last argument before the variadic arguments.</w:t>
+      </w:r>
+    </w:p>
+    <w:p>
+      <w:pPr>
+        <w:pStyle w:val="BodyText"/>
+      </w:pPr>
+      <w:r>
+        <w:t xml:space="preserve">The compiler uses register I3 to store the offset of n relative to the frame pointer (I1). This offset is calculated during the function definition and allows the function to access n during execution. The value of n is then used to access </w:t>
+      </w:r>
+      <w:proofErr w:type="gramStart"/>
+      <w:r>
+        <w:t>the variadic</w:t>
+      </w:r>
+      <w:proofErr w:type="gramEnd"/>
+      <w:r>
+        <w:t xml:space="preserve"> arguments.</w:t>
       </w:r>
     </w:p>
     <w:p>
@@ -4353,45 +4737,7 @@
         <w:rPr>
           <w:rFonts w:ascii="David" w:eastAsia="David" w:hAnsi="David" w:cs="David"/>
         </w:rPr>
-        <w:t xml:space="preserve"> The variadic arguments are stored sequentially on the stack, starting at the offset immediately after the fixed parameters. The compiler calculates the offset of each variadic argument using the value of n stored at I3. For example:</w:t>
-      </w:r>
-    </w:p>
-    <w:p>
-      <w:pPr>
-        <w:pStyle w:val="ListParagraph"/>
-        <w:numPr>
-          <w:ilvl w:val="1"/>
-          <w:numId w:val="193"/>
-        </w:numPr>
-        <w:spacing w:after="0" w:line="276" w:lineRule="auto"/>
-        <w:rPr>
-          <w:rFonts w:ascii="David" w:eastAsia="David" w:hAnsi="David" w:cs="David"/>
-        </w:rPr>
-      </w:pPr>
-      <w:r>
-        <w:rPr>
-          <w:rFonts w:ascii="David" w:eastAsia="David" w:hAnsi="David" w:cs="David"/>
-        </w:rPr>
-        <w:t>The first variadic argument is at I1 -8 - 4 * (n - 1).</w:t>
-      </w:r>
-    </w:p>
-    <w:p>
-      <w:pPr>
-        <w:pStyle w:val="ListParagraph"/>
-        <w:numPr>
-          <w:ilvl w:val="1"/>
-          <w:numId w:val="193"/>
-        </w:numPr>
-        <w:spacing w:after="0" w:line="276" w:lineRule="auto"/>
-        <w:rPr>
-          <w:rFonts w:ascii="David" w:eastAsia="David" w:hAnsi="David" w:cs="David"/>
-        </w:rPr>
-      </w:pPr>
-      <w:r>
-        <w:rPr>
-          <w:rFonts w:ascii="David" w:eastAsia="David" w:hAnsi="David" w:cs="David"/>
-        </w:rPr>
-        <w:t>The second variadic argument is at I1 -8 - 4 * (n - 2), and so on.</w:t>
+        <w:t xml:space="preserve"> The variadic arguments are stored sequentially on the stack, starting at the offset immediately after the fixed parameters. The compiler calculates the offset of each variadic argument using the value of n stored at I3. </w:t>
       </w:r>
     </w:p>
     <w:p>
@@ -4737,7 +5083,7 @@
         <w:pStyle w:val="ListParagraph"/>
         <w:numPr>
           <w:ilvl w:val="0"/>
-          <w:numId w:val="1"/>
+          <w:numId w:val="198"/>
         </w:numPr>
         <w:spacing w:before="240" w:after="240" w:line="276" w:lineRule="auto"/>
         <w:jc w:val="both"/>
@@ -4749,17 +5095,42 @@
         <w:rPr>
           <w:rFonts w:ascii="David" w:eastAsia="David" w:hAnsi="David" w:cs="David"/>
         </w:rPr>
-        <w:t>Temporary registers are allocated sequentially starting from I3. When a temporary value is no longer needed, its register is made available for reuse.</w:t>
-      </w:r>
-    </w:p>
-    <w:p>
-      <w:pPr>
+        <w:t>Temporary registers are allocated sequentially starting from I3 for integer operations and F3 for floating-point operations. These registers are used to store intermediate results during expression evaluation and other computations.</w:t>
+      </w:r>
+    </w:p>
+    <w:p>
+      <w:pPr>
+        <w:pStyle w:val="ListParagraph"/>
+        <w:numPr>
+          <w:ilvl w:val="0"/>
+          <w:numId w:val="198"/>
+        </w:numPr>
         <w:spacing w:before="240" w:after="240" w:line="276" w:lineRule="auto"/>
         <w:jc w:val="both"/>
         <w:rPr>
           <w:rFonts w:ascii="David" w:eastAsia="David" w:hAnsi="David" w:cs="David"/>
         </w:rPr>
       </w:pPr>
+      <w:r>
+        <w:rPr>
+          <w:rFonts w:ascii="David" w:eastAsia="David" w:hAnsi="David" w:cs="David"/>
+        </w:rPr>
+        <w:t xml:space="preserve">In the case of variadic functions, </w:t>
+      </w:r>
+      <w:proofErr w:type="gramStart"/>
+      <w:r>
+        <w:rPr>
+          <w:rFonts w:ascii="David" w:eastAsia="David" w:hAnsi="David" w:cs="David"/>
+        </w:rPr>
+        <w:t>the register</w:t>
+      </w:r>
+      <w:proofErr w:type="gramEnd"/>
+      <w:r>
+        <w:rPr>
+          <w:rFonts w:ascii="David" w:eastAsia="David" w:hAnsi="David" w:cs="David"/>
+        </w:rPr>
+        <w:t xml:space="preserve"> I3 is reserved to store the offset of the parameter n (the number of variadic arguments) relative to the frame pointer (I1). This ensures that the function can dynamically access the variadic arguments during execution.</w:t>
+      </w:r>
     </w:p>
     <w:p>
       <w:pPr>
@@ -4799,7 +5170,6 @@
         </w:rPr>
       </w:pPr>
       <w:r>
-        <w:lastRenderedPageBreak/>
         <w:t>6. Compiler Modules</w:t>
       </w:r>
     </w:p>
@@ -4941,7 +5311,21 @@
         <w:rPr>
           <w:rFonts w:ascii="David" w:eastAsia="David" w:hAnsi="David" w:cs="David"/>
         </w:rPr>
-        <w:t>: Written in Bison, using an LR grammar.</w:t>
+        <w:t xml:space="preserve">: Written in Bison, using </w:t>
+      </w:r>
+      <w:proofErr w:type="gramStart"/>
+      <w:r>
+        <w:rPr>
+          <w:rFonts w:ascii="David" w:eastAsia="David" w:hAnsi="David" w:cs="David"/>
+        </w:rPr>
+        <w:t>an LR</w:t>
+      </w:r>
+      <w:proofErr w:type="gramEnd"/>
+      <w:r>
+        <w:rPr>
+          <w:rFonts w:ascii="David" w:eastAsia="David" w:hAnsi="David" w:cs="David"/>
+        </w:rPr>
+        <w:t xml:space="preserve"> grammar.</w:t>
       </w:r>
     </w:p>
     <w:p>
@@ -5343,13 +5727,23 @@
         </w:rPr>
         <w:t xml:space="preserve">The compiler uses the C++ STL for </w:t>
       </w:r>
-      <w:r>
-        <w:rPr>
-          <w:rStyle w:val="VerbatimChar"/>
-          <w:rFonts w:ascii="David" w:eastAsia="David" w:hAnsi="David" w:cs="David"/>
-          <w:sz w:val="24"/>
-        </w:rPr>
-        <w:t>std::map</w:t>
+      <w:proofErr w:type="gramStart"/>
+      <w:r>
+        <w:rPr>
+          <w:rStyle w:val="VerbatimChar"/>
+          <w:rFonts w:ascii="David" w:eastAsia="David" w:hAnsi="David" w:cs="David"/>
+          <w:sz w:val="24"/>
+        </w:rPr>
+        <w:t>std::</w:t>
+      </w:r>
+      <w:proofErr w:type="gramEnd"/>
+      <w:r>
+        <w:rPr>
+          <w:rStyle w:val="VerbatimChar"/>
+          <w:rFonts w:ascii="David" w:eastAsia="David" w:hAnsi="David" w:cs="David"/>
+          <w:sz w:val="24"/>
+        </w:rPr>
+        <w:t>map</w:t>
       </w:r>
       <w:r>
         <w:rPr>
@@ -6297,6 +6691,119 @@
     </w:lvl>
   </w:abstractNum>
   <w:abstractNum w:abstractNumId="17" w15:restartNumberingAfterBreak="0">
+    <w:nsid w:val="2CEB5D73"/>
+    <w:multiLevelType w:val="hybridMultilevel"/>
+    <w:tmpl w:val="88AE0CB0"/>
+    <w:lvl w:ilvl="0" w:tplc="04090001">
+      <w:start w:val="1"/>
+      <w:numFmt w:val="bullet"/>
+      <w:lvlText w:val=""/>
+      <w:lvlJc w:val="left"/>
+      <w:pPr>
+        <w:ind w:left="720" w:hanging="360"/>
+      </w:pPr>
+      <w:rPr>
+        <w:rFonts w:ascii="Symbol" w:hAnsi="Symbol" w:hint="default"/>
+      </w:rPr>
+    </w:lvl>
+    <w:lvl w:ilvl="1" w:tplc="04090003" w:tentative="1">
+      <w:start w:val="1"/>
+      <w:numFmt w:val="bullet"/>
+      <w:lvlText w:val="o"/>
+      <w:lvlJc w:val="left"/>
+      <w:pPr>
+        <w:ind w:left="1440" w:hanging="360"/>
+      </w:pPr>
+      <w:rPr>
+        <w:rFonts w:ascii="Courier New" w:hAnsi="Courier New" w:cs="Courier New" w:hint="default"/>
+      </w:rPr>
+    </w:lvl>
+    <w:lvl w:ilvl="2" w:tplc="04090005" w:tentative="1">
+      <w:start w:val="1"/>
+      <w:numFmt w:val="bullet"/>
+      <w:lvlText w:val=""/>
+      <w:lvlJc w:val="left"/>
+      <w:pPr>
+        <w:ind w:left="2160" w:hanging="360"/>
+      </w:pPr>
+      <w:rPr>
+        <w:rFonts w:ascii="Wingdings" w:hAnsi="Wingdings" w:hint="default"/>
+      </w:rPr>
+    </w:lvl>
+    <w:lvl w:ilvl="3" w:tplc="04090001" w:tentative="1">
+      <w:start w:val="1"/>
+      <w:numFmt w:val="bullet"/>
+      <w:lvlText w:val=""/>
+      <w:lvlJc w:val="left"/>
+      <w:pPr>
+        <w:ind w:left="2880" w:hanging="360"/>
+      </w:pPr>
+      <w:rPr>
+        <w:rFonts w:ascii="Symbol" w:hAnsi="Symbol" w:hint="default"/>
+      </w:rPr>
+    </w:lvl>
+    <w:lvl w:ilvl="4" w:tplc="04090003" w:tentative="1">
+      <w:start w:val="1"/>
+      <w:numFmt w:val="bullet"/>
+      <w:lvlText w:val="o"/>
+      <w:lvlJc w:val="left"/>
+      <w:pPr>
+        <w:ind w:left="3600" w:hanging="360"/>
+      </w:pPr>
+      <w:rPr>
+        <w:rFonts w:ascii="Courier New" w:hAnsi="Courier New" w:cs="Courier New" w:hint="default"/>
+      </w:rPr>
+    </w:lvl>
+    <w:lvl w:ilvl="5" w:tplc="04090005" w:tentative="1">
+      <w:start w:val="1"/>
+      <w:numFmt w:val="bullet"/>
+      <w:lvlText w:val=""/>
+      <w:lvlJc w:val="left"/>
+      <w:pPr>
+        <w:ind w:left="4320" w:hanging="360"/>
+      </w:pPr>
+      <w:rPr>
+        <w:rFonts w:ascii="Wingdings" w:hAnsi="Wingdings" w:hint="default"/>
+      </w:rPr>
+    </w:lvl>
+    <w:lvl w:ilvl="6" w:tplc="04090001" w:tentative="1">
+      <w:start w:val="1"/>
+      <w:numFmt w:val="bullet"/>
+      <w:lvlText w:val=""/>
+      <w:lvlJc w:val="left"/>
+      <w:pPr>
+        <w:ind w:left="5040" w:hanging="360"/>
+      </w:pPr>
+      <w:rPr>
+        <w:rFonts w:ascii="Symbol" w:hAnsi="Symbol" w:hint="default"/>
+      </w:rPr>
+    </w:lvl>
+    <w:lvl w:ilvl="7" w:tplc="04090003" w:tentative="1">
+      <w:start w:val="1"/>
+      <w:numFmt w:val="bullet"/>
+      <w:lvlText w:val="o"/>
+      <w:lvlJc w:val="left"/>
+      <w:pPr>
+        <w:ind w:left="5760" w:hanging="360"/>
+      </w:pPr>
+      <w:rPr>
+        <w:rFonts w:ascii="Courier New" w:hAnsi="Courier New" w:cs="Courier New" w:hint="default"/>
+      </w:rPr>
+    </w:lvl>
+    <w:lvl w:ilvl="8" w:tplc="04090005" w:tentative="1">
+      <w:start w:val="1"/>
+      <w:numFmt w:val="bullet"/>
+      <w:lvlText w:val=""/>
+      <w:lvlJc w:val="left"/>
+      <w:pPr>
+        <w:ind w:left="6480" w:hanging="360"/>
+      </w:pPr>
+      <w:rPr>
+        <w:rFonts w:ascii="Wingdings" w:hAnsi="Wingdings" w:hint="default"/>
+      </w:rPr>
+    </w:lvl>
+  </w:abstractNum>
+  <w:abstractNum w:abstractNumId="18" w15:restartNumberingAfterBreak="0">
     <w:nsid w:val="2E33A93C"/>
     <w:multiLevelType w:val="hybridMultilevel"/>
     <w:tmpl w:val="D354C034"/>
@@ -6409,7 +6916,7 @@
       </w:rPr>
     </w:lvl>
   </w:abstractNum>
-  <w:abstractNum w:abstractNumId="18" w15:restartNumberingAfterBreak="0">
+  <w:abstractNum w:abstractNumId="19" w15:restartNumberingAfterBreak="0">
     <w:nsid w:val="36E75147"/>
     <w:multiLevelType w:val="hybridMultilevel"/>
     <w:tmpl w:val="69F8A836"/>
@@ -6522,7 +7029,7 @@
       </w:rPr>
     </w:lvl>
   </w:abstractNum>
-  <w:abstractNum w:abstractNumId="19" w15:restartNumberingAfterBreak="0">
+  <w:abstractNum w:abstractNumId="20" w15:restartNumberingAfterBreak="0">
     <w:nsid w:val="3E42C925"/>
     <w:multiLevelType w:val="hybridMultilevel"/>
     <w:tmpl w:val="E55A503E"/>
@@ -6608,7 +7115,7 @@
       </w:pPr>
     </w:lvl>
   </w:abstractNum>
-  <w:abstractNum w:abstractNumId="20" w15:restartNumberingAfterBreak="0">
+  <w:abstractNum w:abstractNumId="21" w15:restartNumberingAfterBreak="0">
     <w:nsid w:val="44F6F3C4"/>
     <w:multiLevelType w:val="hybridMultilevel"/>
     <w:tmpl w:val="1A14F520"/>
@@ -6721,7 +7228,7 @@
       </w:rPr>
     </w:lvl>
   </w:abstractNum>
-  <w:abstractNum w:abstractNumId="21" w15:restartNumberingAfterBreak="0">
+  <w:abstractNum w:abstractNumId="22" w15:restartNumberingAfterBreak="0">
     <w:nsid w:val="45C41281"/>
     <w:multiLevelType w:val="hybridMultilevel"/>
     <w:tmpl w:val="8B7ECE20"/>
@@ -6807,7 +7314,7 @@
       </w:pPr>
     </w:lvl>
   </w:abstractNum>
-  <w:abstractNum w:abstractNumId="22" w15:restartNumberingAfterBreak="0">
+  <w:abstractNum w:abstractNumId="23" w15:restartNumberingAfterBreak="0">
     <w:nsid w:val="5FB0809C"/>
     <w:multiLevelType w:val="hybridMultilevel"/>
     <w:tmpl w:val="C62C3B38"/>
@@ -6920,7 +7427,7 @@
       </w:rPr>
     </w:lvl>
   </w:abstractNum>
-  <w:abstractNum w:abstractNumId="23" w15:restartNumberingAfterBreak="0">
+  <w:abstractNum w:abstractNumId="24" w15:restartNumberingAfterBreak="0">
     <w:nsid w:val="637B304C"/>
     <w:multiLevelType w:val="hybridMultilevel"/>
     <w:tmpl w:val="9AC2A4A8"/>
@@ -7034,19 +7541,19 @@
     </w:lvl>
   </w:abstractNum>
   <w:num w:numId="1" w16cid:durableId="224462565">
-    <w:abstractNumId w:val="22"/>
+    <w:abstractNumId w:val="23"/>
   </w:num>
   <w:num w:numId="2" w16cid:durableId="1031615218">
     <w:abstractNumId w:val="13"/>
   </w:num>
   <w:num w:numId="3" w16cid:durableId="478770975">
-    <w:abstractNumId w:val="23"/>
+    <w:abstractNumId w:val="24"/>
   </w:num>
   <w:num w:numId="4" w16cid:durableId="470565294">
-    <w:abstractNumId w:val="20"/>
+    <w:abstractNumId w:val="21"/>
   </w:num>
   <w:num w:numId="5" w16cid:durableId="291642849">
-    <w:abstractNumId w:val="17"/>
+    <w:abstractNumId w:val="18"/>
   </w:num>
   <w:num w:numId="6" w16cid:durableId="966202713">
     <w:abstractNumId w:val="16"/>
@@ -7055,13 +7562,13 @@
     <w:abstractNumId w:val="15"/>
   </w:num>
   <w:num w:numId="8" w16cid:durableId="207767115">
-    <w:abstractNumId w:val="18"/>
+    <w:abstractNumId w:val="19"/>
   </w:num>
   <w:num w:numId="9" w16cid:durableId="36467122">
-    <w:abstractNumId w:val="19"/>
+    <w:abstractNumId w:val="20"/>
   </w:num>
   <w:num w:numId="10" w16cid:durableId="1145439715">
-    <w:abstractNumId w:val="21"/>
+    <w:abstractNumId w:val="22"/>
   </w:num>
   <w:num w:numId="11" w16cid:durableId="1124693139">
     <w:abstractNumId w:val="14"/>
@@ -7677,6 +8184,9 @@
   </w:num>
   <w:num w:numId="197" w16cid:durableId="936063334">
     <w:abstractNumId w:val="11"/>
+  </w:num>
+  <w:num w:numId="198" w16cid:durableId="930309114">
+    <w:abstractNumId w:val="17"/>
   </w:num>
 </w:numbering>
 </file>

</xml_diff>

<commit_message>
Remove block backpatching sentence and semantic_error file from tests
</commit_message>
<xml_diff>
--- a/CompilerDesign.docx
+++ b/CompilerDesign.docx
@@ -3947,96 +3947,6 @@
     </w:p>
     <w:p>
       <w:pPr>
-        <w:pStyle w:val="ListParagraph"/>
-        <w:numPr>
-          <w:ilvl w:val="0"/>
-          <w:numId w:val="10"/>
-        </w:numPr>
-        <w:spacing w:before="240" w:after="240" w:line="276" w:lineRule="auto"/>
-        <w:jc w:val="both"/>
-        <w:rPr>
-          <w:rFonts w:ascii="David" w:eastAsia="David" w:hAnsi="David" w:cs="David"/>
-        </w:rPr>
-      </w:pPr>
-      <w:r>
-        <w:rPr>
-          <w:rFonts w:ascii="David" w:eastAsia="David" w:hAnsi="David" w:cs="David"/>
-          <w:b/>
-          <w:bCs/>
-        </w:rPr>
-        <w:t>Exiting a Block</w:t>
-      </w:r>
-      <w:r>
-        <w:rPr>
-          <w:rFonts w:ascii="David" w:eastAsia="David" w:hAnsi="David" w:cs="David"/>
-        </w:rPr>
-        <w:t>:</w:t>
-      </w:r>
-    </w:p>
-    <w:p>
-      <w:pPr>
-        <w:pStyle w:val="ListParagraph"/>
-        <w:numPr>
-          <w:ilvl w:val="1"/>
-          <w:numId w:val="10"/>
-        </w:numPr>
-        <w:spacing w:after="0" w:line="276" w:lineRule="auto"/>
-        <w:jc w:val="both"/>
-        <w:rPr>
-          <w:rFonts w:ascii="David" w:eastAsia="David" w:hAnsi="David" w:cs="David"/>
-        </w:rPr>
-      </w:pPr>
-      <w:r>
-        <w:rPr>
-          <w:rFonts w:ascii="David" w:eastAsia="David" w:hAnsi="David" w:cs="David"/>
-        </w:rPr>
-        <w:t xml:space="preserve">When reducing a block (BLK), the </w:t>
-      </w:r>
-      <w:proofErr w:type="spellStart"/>
-      <w:r>
-        <w:rPr>
-          <w:rFonts w:ascii="David" w:eastAsia="David" w:hAnsi="David" w:cs="David"/>
-          <w:b/>
-          <w:bCs/>
-        </w:rPr>
-        <w:t>nextList</w:t>
-      </w:r>
-      <w:proofErr w:type="spellEnd"/>
-      <w:r>
-        <w:rPr>
-          <w:rFonts w:ascii="David" w:eastAsia="David" w:hAnsi="David" w:cs="David"/>
-        </w:rPr>
-        <w:t xml:space="preserve"> of the block is backpatched to the</w:t>
-      </w:r>
-      <w:r>
-        <w:rPr>
-          <w:rFonts w:ascii="David" w:eastAsia="David" w:hAnsi="David" w:cs="David"/>
-        </w:rPr>
-        <w:t xml:space="preserve"> </w:t>
-      </w:r>
-      <w:proofErr w:type="gramStart"/>
-      <w:r>
-        <w:rPr>
-          <w:rFonts w:ascii="David" w:eastAsia="David" w:hAnsi="David" w:cs="David"/>
-        </w:rPr>
-        <w:t xml:space="preserve">next </w:t>
-      </w:r>
-      <w:r>
-        <w:rPr>
-          <w:rFonts w:ascii="David" w:eastAsia="David" w:hAnsi="David" w:cs="David"/>
-        </w:rPr>
-        <w:t xml:space="preserve"> block</w:t>
-      </w:r>
-      <w:proofErr w:type="gramEnd"/>
-      <w:r>
-        <w:rPr>
-          <w:rFonts w:ascii="David" w:eastAsia="David" w:hAnsi="David" w:cs="David"/>
-        </w:rPr>
-        <w:t>.</w:t>
-      </w:r>
-    </w:p>
-    <w:p>
-      <w:pPr>
         <w:pStyle w:val="Heading4"/>
         <w:spacing w:before="319" w:after="319" w:line="276" w:lineRule="auto"/>
         <w:jc w:val="both"/>
@@ -4048,7 +3958,12 @@
           <w:iCs w:val="0"/>
         </w:rPr>
       </w:pPr>
-      <w:r>
+    </w:p>
+    <w:p>
+      <w:pPr>
+        <w:pStyle w:val="Heading4"/>
+        <w:spacing w:before="319" w:after="319" w:line="276" w:lineRule="auto"/>
+        <w:jc w:val="both"/>
         <w:rPr>
           <w:rFonts w:ascii="David" w:eastAsia="David" w:hAnsi="David" w:cs="David"/>
           <w:b/>
@@ -4056,7 +3971,15 @@
           <w:i w:val="0"/>
           <w:iCs w:val="0"/>
         </w:rPr>
-        <w:lastRenderedPageBreak/>
+      </w:pPr>
+      <w:r>
+        <w:rPr>
+          <w:rFonts w:ascii="David" w:eastAsia="David" w:hAnsi="David" w:cs="David"/>
+          <w:b/>
+          <w:bCs/>
+          <w:i w:val="0"/>
+          <w:iCs w:val="0"/>
+        </w:rPr>
         <w:t>Function Calls</w:t>
       </w:r>
     </w:p>
@@ -4415,15 +4338,6 @@
           <w:rFonts w:ascii="David" w:eastAsia="David" w:hAnsi="David" w:cs="David"/>
         </w:rPr>
       </w:pPr>
-      <w:r>
-        <w:br/>
-      </w:r>
-      <w:r>
-        <w:rPr>
-          <w:rFonts w:ascii="David" w:eastAsia="David" w:hAnsi="David" w:cs="David"/>
-        </w:rPr>
-        <w:t xml:space="preserve"> </w:t>
-      </w:r>
     </w:p>
     <w:p>
       <w:pPr>
@@ -4668,7 +4582,6 @@
           <w:b/>
           <w:bCs/>
         </w:rPr>
-        <w:lastRenderedPageBreak/>
         <w:t>Variadic Functions and Register I3</w:t>
       </w:r>
     </w:p>

</xml_diff>